<commit_message>
[chore: 0.0.0] .|. Add AVP Office
</commit_message>
<xml_diff>
--- a/public/resources/docs/static-web-app-presenters.docx
+++ b/public/resources/docs/static-web-app-presenters.docx
@@ -508,7 +508,7 @@
                 <w:sz w:val="28"/>
                 <w:szCs w:val="28"/>
               </w:rPr>
-              <w:t>Javellana</w:t>
+              <w:t>Kenneth Paul C. Javellana</w:t>
             </w:r>
           </w:p>
         </w:tc>
@@ -780,7 +780,7 @@
                 <w:sz w:val="28"/>
                 <w:szCs w:val="28"/>
               </w:rPr>
-              <w:t>Registrar</w:t>
+              <w:t>Office of the Registrar</w:t>
             </w:r>
           </w:p>
         </w:tc>
@@ -948,7 +948,7 @@
                 <w:sz w:val="28"/>
                 <w:szCs w:val="28"/>
               </w:rPr>
-              <w:t>Dept. of ICT</w:t>
+              <w:t>College of ICT -</w:t>
             </w:r>
           </w:p>
         </w:tc>
@@ -1154,8 +1154,19 @@
                 <w:sz w:val="28"/>
                 <w:szCs w:val="28"/>
               </w:rPr>
+              <w:t xml:space="preserve">Hiroshi </w:t>
+            </w:r>
+            <w:proofErr w:type="spellStart"/>
+            <w:r>
+              <w:rPr>
+                <w:b/>
+                <w:bCs/>
+                <w:sz w:val="28"/>
+                <w:szCs w:val="28"/>
+              </w:rPr>
               <w:t>Macabenta</w:t>
             </w:r>
+            <w:proofErr w:type="spellEnd"/>
           </w:p>
         </w:tc>
         <w:tc>
@@ -1228,6 +1239,15 @@
                 <w:szCs w:val="28"/>
               </w:rPr>
             </w:pPr>
+            <w:r>
+              <w:rPr>
+                <w:b/>
+                <w:bCs/>
+                <w:sz w:val="28"/>
+                <w:szCs w:val="28"/>
+              </w:rPr>
+              <w:t>Algin V. Rivera</w:t>
+            </w:r>
           </w:p>
         </w:tc>
         <w:tc>
@@ -1245,6 +1265,15 @@
                 <w:szCs w:val="28"/>
               </w:rPr>
             </w:pPr>
+            <w:r>
+              <w:rPr>
+                <w:b/>
+                <w:bCs/>
+                <w:sz w:val="28"/>
+                <w:szCs w:val="28"/>
+              </w:rPr>
+              <w:t>Guidance Office</w:t>
+            </w:r>
           </w:p>
         </w:tc>
       </w:tr>
@@ -1794,7 +1823,6 @@
                 <w:sz w:val="28"/>
                 <w:szCs w:val="28"/>
               </w:rPr>
-              <w:lastRenderedPageBreak/>
               <w:t>Time</w:t>
             </w:r>
           </w:p>
@@ -1896,7 +1924,7 @@
                 <w:sz w:val="28"/>
                 <w:szCs w:val="28"/>
               </w:rPr>
-              <w:t>Rivera</w:t>
+              <w:t>Del Norte</w:t>
             </w:r>
           </w:p>
         </w:tc>
@@ -1922,7 +1950,7 @@
                 <w:sz w:val="28"/>
                 <w:szCs w:val="28"/>
               </w:rPr>
-              <w:t>Guidance Office &amp; Property Custodian</w:t>
+              <w:t>Dept. of CHTM</w:t>
             </w:r>
           </w:p>
         </w:tc>
@@ -1967,15 +1995,17 @@
                 <w:szCs w:val="28"/>
               </w:rPr>
             </w:pPr>
-            <w:r>
-              <w:rPr>
-                <w:b/>
-                <w:bCs/>
-                <w:sz w:val="28"/>
-                <w:szCs w:val="28"/>
-              </w:rPr>
-              <w:t>Del Norte</w:t>
-            </w:r>
+            <w:proofErr w:type="spellStart"/>
+            <w:r>
+              <w:rPr>
+                <w:b/>
+                <w:bCs/>
+                <w:sz w:val="28"/>
+                <w:szCs w:val="28"/>
+              </w:rPr>
+              <w:t>Aparecio</w:t>
+            </w:r>
+            <w:proofErr w:type="spellEnd"/>
           </w:p>
         </w:tc>
         <w:tc>
@@ -2000,7 +2030,7 @@
                 <w:sz w:val="28"/>
                 <w:szCs w:val="28"/>
               </w:rPr>
-              <w:t>Dept. of CHTM</w:t>
+              <w:t>Dept. of Nursing</w:t>
             </w:r>
           </w:p>
         </w:tc>
@@ -2048,6 +2078,15 @@
                 <w:szCs w:val="28"/>
               </w:rPr>
             </w:pPr>
+            <w:r>
+              <w:rPr>
+                <w:b/>
+                <w:bCs/>
+                <w:sz w:val="28"/>
+                <w:szCs w:val="28"/>
+              </w:rPr>
+              <w:t xml:space="preserve">Noriel </w:t>
+            </w:r>
             <w:proofErr w:type="spellStart"/>
             <w:r>
               <w:rPr>
@@ -2056,7 +2095,7 @@
                 <w:sz w:val="28"/>
                 <w:szCs w:val="28"/>
               </w:rPr>
-              <w:t>Aparecio</w:t>
+              <w:t>Guirhem</w:t>
             </w:r>
             <w:proofErr w:type="spellEnd"/>
           </w:p>
@@ -2083,7 +2122,7 @@
                 <w:sz w:val="28"/>
                 <w:szCs w:val="28"/>
               </w:rPr>
-              <w:t>Dept. of Nursing</w:t>
+              <w:t>Dept. of Business Administration</w:t>
             </w:r>
           </w:p>
         </w:tc>
@@ -2128,17 +2167,6 @@
                 <w:szCs w:val="28"/>
               </w:rPr>
             </w:pPr>
-            <w:proofErr w:type="spellStart"/>
-            <w:r>
-              <w:rPr>
-                <w:b/>
-                <w:bCs/>
-                <w:sz w:val="28"/>
-                <w:szCs w:val="28"/>
-              </w:rPr>
-              <w:t>Tajaon</w:t>
-            </w:r>
-            <w:proofErr w:type="spellEnd"/>
           </w:p>
         </w:tc>
         <w:tc>
@@ -2156,15 +2184,6 @@
                 <w:szCs w:val="28"/>
               </w:rPr>
             </w:pPr>
-            <w:r>
-              <w:rPr>
-                <w:b/>
-                <w:bCs/>
-                <w:sz w:val="28"/>
-                <w:szCs w:val="28"/>
-              </w:rPr>
-              <w:t>Dept. of Business Administration</w:t>
-            </w:r>
           </w:p>
         </w:tc>
       </w:tr>
@@ -2176,13 +2195,14 @@
           <w:tcPr>
             <w:cnfStyle w:val="001000000000" w:firstRow="0" w:lastRow="0" w:firstColumn="1" w:lastColumn="0" w:oddVBand="0" w:evenVBand="0" w:oddHBand="0" w:evenHBand="0" w:firstRowFirstColumn="0" w:firstRowLastColumn="0" w:lastRowFirstColumn="0" w:lastRowLastColumn="0"/>
             <w:tcW w:w="2901" w:type="dxa"/>
-            <w:hideMark/>
-          </w:tcPr>
-          <w:p>
-            <w:pPr>
-              <w:spacing w:after="160" w:line="259" w:lineRule="auto"/>
+          </w:tcPr>
+          <w:p>
+            <w:pPr>
+              <w:spacing w:line="276" w:lineRule="auto"/>
               <w:jc w:val="center"/>
               <w:rPr>
+                <w:b w:val="0"/>
+                <w:bCs w:val="0"/>
                 <w:sz w:val="28"/>
                 <w:szCs w:val="28"/>
               </w:rPr>
@@ -2202,7 +2222,7 @@
           </w:tcPr>
           <w:p>
             <w:pPr>
-              <w:spacing w:after="160" w:line="259" w:lineRule="auto"/>
+              <w:spacing w:line="276" w:lineRule="auto"/>
               <w:cnfStyle w:val="000000100000" w:firstRow="0" w:lastRow="0" w:firstColumn="0" w:lastColumn="0" w:oddVBand="0" w:evenVBand="0" w:oddHBand="1" w:evenHBand="0" w:firstRowFirstColumn="0" w:firstRowLastColumn="0" w:lastRowFirstColumn="0" w:lastRowLastColumn="0"/>
               <w:rPr>
                 <w:b/>
@@ -2219,7 +2239,7 @@
           </w:tcPr>
           <w:p>
             <w:pPr>
-              <w:spacing w:after="160" w:line="259" w:lineRule="auto"/>
+              <w:spacing w:line="276" w:lineRule="auto"/>
               <w:cnfStyle w:val="000000100000" w:firstRow="0" w:lastRow="0" w:firstColumn="0" w:lastColumn="0" w:oddVBand="0" w:evenVBand="0" w:oddHBand="1" w:evenHBand="0" w:firstRowFirstColumn="0" w:firstRowLastColumn="0" w:lastRowFirstColumn="0" w:lastRowLastColumn="0"/>
               <w:rPr>
                 <w:b/>
@@ -2861,70 +2881,6 @@
           <w:tcPr>
             <w:cnfStyle w:val="001000000000" w:firstRow="0" w:lastRow="0" w:firstColumn="1" w:lastColumn="0" w:oddVBand="0" w:evenVBand="0" w:oddHBand="0" w:evenHBand="0" w:firstRowFirstColumn="0" w:firstRowLastColumn="0" w:lastRowFirstColumn="0" w:lastRowLastColumn="0"/>
             <w:tcW w:w="2901" w:type="dxa"/>
-          </w:tcPr>
-          <w:p>
-            <w:pPr>
-              <w:spacing w:line="276" w:lineRule="auto"/>
-              <w:jc w:val="center"/>
-              <w:rPr>
-                <w:b w:val="0"/>
-                <w:bCs w:val="0"/>
-                <w:sz w:val="28"/>
-                <w:szCs w:val="28"/>
-              </w:rPr>
-            </w:pPr>
-            <w:r>
-              <w:rPr>
-                <w:sz w:val="28"/>
-                <w:szCs w:val="28"/>
-              </w:rPr>
-              <w:t>–</w:t>
-            </w:r>
-          </w:p>
-        </w:tc>
-        <w:tc>
-          <w:tcPr>
-            <w:tcW w:w="2314" w:type="dxa"/>
-          </w:tcPr>
-          <w:p>
-            <w:pPr>
-              <w:spacing w:line="276" w:lineRule="auto"/>
-              <w:cnfStyle w:val="000000000000" w:firstRow="0" w:lastRow="0" w:firstColumn="0" w:lastColumn="0" w:oddVBand="0" w:evenVBand="0" w:oddHBand="0" w:evenHBand="0" w:firstRowFirstColumn="0" w:firstRowLastColumn="0" w:lastRowFirstColumn="0" w:lastRowLastColumn="0"/>
-              <w:rPr>
-                <w:b/>
-                <w:bCs/>
-                <w:sz w:val="28"/>
-                <w:szCs w:val="28"/>
-              </w:rPr>
-            </w:pPr>
-          </w:p>
-        </w:tc>
-        <w:tc>
-          <w:tcPr>
-            <w:tcW w:w="3801" w:type="dxa"/>
-          </w:tcPr>
-          <w:p>
-            <w:pPr>
-              <w:spacing w:line="276" w:lineRule="auto"/>
-              <w:cnfStyle w:val="000000000000" w:firstRow="0" w:lastRow="0" w:firstColumn="0" w:lastColumn="0" w:oddVBand="0" w:evenVBand="0" w:oddHBand="0" w:evenHBand="0" w:firstRowFirstColumn="0" w:firstRowLastColumn="0" w:lastRowFirstColumn="0" w:lastRowLastColumn="0"/>
-              <w:rPr>
-                <w:b/>
-                <w:bCs/>
-                <w:sz w:val="28"/>
-                <w:szCs w:val="28"/>
-              </w:rPr>
-            </w:pPr>
-          </w:p>
-        </w:tc>
-      </w:tr>
-      <w:tr>
-        <w:trPr>
-          <w:cnfStyle w:val="000000100000" w:firstRow="0" w:lastRow="0" w:firstColumn="0" w:lastColumn="0" w:oddVBand="0" w:evenVBand="0" w:oddHBand="1" w:evenHBand="0" w:firstRowFirstColumn="0" w:firstRowLastColumn="0" w:lastRowFirstColumn="0" w:lastRowLastColumn="0"/>
-        </w:trPr>
-        <w:tc>
-          <w:tcPr>
-            <w:cnfStyle w:val="001000000000" w:firstRow="0" w:lastRow="0" w:firstColumn="1" w:lastColumn="0" w:oddVBand="0" w:evenVBand="0" w:oddHBand="0" w:evenHBand="0" w:firstRowFirstColumn="0" w:firstRowLastColumn="0" w:lastRowFirstColumn="0" w:lastRowLastColumn="0"/>
-            <w:tcW w:w="2901" w:type="dxa"/>
             <w:hideMark/>
           </w:tcPr>
           <w:p>
@@ -2952,7 +2908,7 @@
           <w:p>
             <w:pPr>
               <w:spacing w:after="160" w:line="259" w:lineRule="auto"/>
-              <w:cnfStyle w:val="000000100000" w:firstRow="0" w:lastRow="0" w:firstColumn="0" w:lastColumn="0" w:oddVBand="0" w:evenVBand="0" w:oddHBand="1" w:evenHBand="0" w:firstRowFirstColumn="0" w:firstRowLastColumn="0" w:lastRowFirstColumn="0" w:lastRowLastColumn="0"/>
+              <w:cnfStyle w:val="000000000000" w:firstRow="0" w:lastRow="0" w:firstColumn="0" w:lastColumn="0" w:oddVBand="0" w:evenVBand="0" w:oddHBand="0" w:evenHBand="0" w:firstRowFirstColumn="0" w:firstRowLastColumn="0" w:lastRowFirstColumn="0" w:lastRowLastColumn="0"/>
               <w:rPr>
                 <w:b/>
                 <w:bCs/>
@@ -2969,7 +2925,7 @@
           <w:p>
             <w:pPr>
               <w:spacing w:after="160" w:line="259" w:lineRule="auto"/>
-              <w:cnfStyle w:val="000000100000" w:firstRow="0" w:lastRow="0" w:firstColumn="0" w:lastColumn="0" w:oddVBand="0" w:evenVBand="0" w:oddHBand="1" w:evenHBand="0" w:firstRowFirstColumn="0" w:firstRowLastColumn="0" w:lastRowFirstColumn="0" w:lastRowLastColumn="0"/>
+              <w:cnfStyle w:val="000000000000" w:firstRow="0" w:lastRow="0" w:firstColumn="0" w:lastColumn="0" w:oddVBand="0" w:evenVBand="0" w:oddHBand="0" w:evenHBand="0" w:firstRowFirstColumn="0" w:firstRowLastColumn="0" w:lastRowFirstColumn="0" w:lastRowLastColumn="0"/>
               <w:rPr>
                 <w:b/>
                 <w:bCs/>
@@ -3691,7 +3647,6 @@
   <w:style w:type="character" w:default="1" w:styleId="DefaultParagraphFont">
     <w:name w:val="Default Paragraph Font"/>
     <w:uiPriority w:val="1"/>
-    <w:semiHidden/>
     <w:unhideWhenUsed/>
   </w:style>
   <w:style w:type="table" w:default="1" w:styleId="TableNormal">

</xml_diff>

<commit_message>
[chore: 0.0.0] .|. Update Registrar
</commit_message>
<xml_diff>
--- a/public/resources/docs/static-web-app-presenters.docx
+++ b/public/resources/docs/static-web-app-presenters.docx
@@ -369,7 +369,14 @@
                 <w:sz w:val="28"/>
                 <w:szCs w:val="28"/>
               </w:rPr>
-              <w:t>03:00</w:t>
+              <w:t>03:</w:t>
+            </w:r>
+            <w:r>
+              <w:rPr>
+                <w:sz w:val="28"/>
+                <w:szCs w:val="28"/>
+              </w:rPr>
+              <w:t>15</w:t>
             </w:r>
             <w:r>
               <w:rPr>
@@ -589,7 +596,7 @@
                 <w:sz w:val="28"/>
                 <w:szCs w:val="28"/>
               </w:rPr>
-              <w:t>Marvin</w:t>
+              <w:t>Marlon Magallanes</w:t>
             </w:r>
           </w:p>
         </w:tc>
@@ -670,8 +677,19 @@
                 <w:sz w:val="28"/>
                 <w:szCs w:val="28"/>
               </w:rPr>
-              <w:t>Pearl</w:t>
-            </w:r>
+              <w:t xml:space="preserve">Kiem </w:t>
+            </w:r>
+            <w:proofErr w:type="spellStart"/>
+            <w:r>
+              <w:rPr>
+                <w:b/>
+                <w:bCs/>
+                <w:sz w:val="28"/>
+                <w:szCs w:val="28"/>
+              </w:rPr>
+              <w:t>Gumapac</w:t>
+            </w:r>
+            <w:proofErr w:type="spellEnd"/>
           </w:p>
         </w:tc>
         <w:tc>
@@ -696,7 +714,7 @@
                 <w:sz w:val="28"/>
                 <w:szCs w:val="28"/>
               </w:rPr>
-              <w:t>Chapel</w:t>
+              <w:t xml:space="preserve">Chapel </w:t>
             </w:r>
           </w:p>
         </w:tc>
@@ -885,6 +903,7 @@
                 <w:sz w:val="28"/>
                 <w:szCs w:val="28"/>
               </w:rPr>
+              <w:lastRenderedPageBreak/>
               <w:t>–</w:t>
             </w:r>
           </w:p>
@@ -972,7 +991,6 @@
                 <w:sz w:val="28"/>
                 <w:szCs w:val="28"/>
               </w:rPr>
-              <w:lastRenderedPageBreak/>
               <w:t>–</w:t>
             </w:r>
           </w:p>
@@ -1317,6 +1335,15 @@
                 <w:szCs w:val="28"/>
               </w:rPr>
             </w:pPr>
+            <w:r>
+              <w:rPr>
+                <w:b/>
+                <w:bCs/>
+                <w:sz w:val="28"/>
+                <w:szCs w:val="28"/>
+              </w:rPr>
+              <w:t>Fernandez Bryan</w:t>
+            </w:r>
           </w:p>
         </w:tc>
         <w:tc>
@@ -1334,6 +1361,24 @@
                 <w:szCs w:val="28"/>
               </w:rPr>
             </w:pPr>
+            <w:r>
+              <w:rPr>
+                <w:b/>
+                <w:bCs/>
+                <w:sz w:val="28"/>
+                <w:szCs w:val="28"/>
+              </w:rPr>
+              <w:t>P</w:t>
+            </w:r>
+            <w:r>
+              <w:rPr>
+                <w:b/>
+                <w:bCs/>
+                <w:sz w:val="28"/>
+                <w:szCs w:val="28"/>
+              </w:rPr>
+              <w:t>roperty Custodian</w:t>
+            </w:r>
           </w:p>
         </w:tc>
       </w:tr>
@@ -3013,6 +3058,7 @@
           <w:sz w:val="28"/>
           <w:szCs w:val="28"/>
         </w:rPr>
+        <w:lastRenderedPageBreak/>
         <w:t>Sincerely,</w:t>
       </w:r>
       <w:r>

</xml_diff>

<commit_message>
[chore: 0.0.0] .|. Update Home page
</commit_message>
<xml_diff>
--- a/public/resources/docs/static-web-app-presenters.docx
+++ b/public/resources/docs/static-web-app-presenters.docx
@@ -84,8 +84,6 @@
       </w:r>
       <w:r>
         <w:rPr>
-          <w:b/>
-          <w:bCs/>
           <w:sz w:val="28"/>
           <w:szCs w:val="28"/>
         </w:rPr>
@@ -113,8 +111,6 @@
       </w:r>
       <w:r>
         <w:rPr>
-          <w:b/>
-          <w:bCs/>
           <w:sz w:val="28"/>
           <w:szCs w:val="28"/>
         </w:rPr>
@@ -143,14 +139,14 @@
           <w:sz w:val="28"/>
           <w:szCs w:val="28"/>
         </w:rPr>
-        <w:t xml:space="preserve">To provide a short demonstration and presentation of the campus information system's static web page application, showcasing its simplicity </w:t>
+        <w:t>To provide a short demonstration and presentation of the campus information system's static web page application, showcasing its simplicity</w:t>
       </w:r>
       <w:r>
         <w:rPr>
           <w:sz w:val="28"/>
           <w:szCs w:val="28"/>
         </w:rPr>
-        <w:t>and functionality.</w:t>
+        <w:t>.</w:t>
       </w:r>
     </w:p>
     <w:p>
@@ -463,7 +459,16 @@
                 <w:sz w:val="28"/>
                 <w:szCs w:val="28"/>
               </w:rPr>
-              <w:t>Dept. of Engineering</w:t>
+              <w:t xml:space="preserve">College </w:t>
+            </w:r>
+            <w:r>
+              <w:rPr>
+                <w:b/>
+                <w:bCs/>
+                <w:sz w:val="28"/>
+                <w:szCs w:val="28"/>
+              </w:rPr>
+              <w:t>of Engineering</w:t>
             </w:r>
           </w:p>
         </w:tc>
@@ -1665,25 +1670,7 @@
           <w:sz w:val="28"/>
           <w:szCs w:val="28"/>
         </w:rPr>
-        <w:t xml:space="preserve">Quick </w:t>
-      </w:r>
-      <w:r>
-        <w:rPr>
-          <w:b/>
-          <w:bCs/>
-          <w:sz w:val="28"/>
-          <w:szCs w:val="28"/>
-        </w:rPr>
-        <w:t>Break</w:t>
-      </w:r>
-      <w:r>
-        <w:rPr>
-          <w:b/>
-          <w:bCs/>
-          <w:sz w:val="28"/>
-          <w:szCs w:val="28"/>
-        </w:rPr>
-        <w:t xml:space="preserve"> | Momentary Break</w:t>
+        <w:t>Momentary Break</w:t>
       </w:r>
       <w:r>
         <w:rPr>
@@ -1703,36 +1690,6 @@
         </w:rPr>
         <w:t>3:45 PM – 4:00 PM (15mins)</w:t>
       </w:r>
-    </w:p>
-    <w:p>
-      <w:pPr>
-        <w:rPr>
-          <w:b/>
-          <w:bCs/>
-          <w:sz w:val="28"/>
-          <w:szCs w:val="28"/>
-        </w:rPr>
-      </w:pPr>
-    </w:p>
-    <w:p>
-      <w:pPr>
-        <w:rPr>
-          <w:b/>
-          <w:bCs/>
-          <w:sz w:val="28"/>
-          <w:szCs w:val="28"/>
-        </w:rPr>
-      </w:pPr>
-    </w:p>
-    <w:p>
-      <w:pPr>
-        <w:rPr>
-          <w:b/>
-          <w:bCs/>
-          <w:sz w:val="28"/>
-          <w:szCs w:val="28"/>
-        </w:rPr>
-      </w:pPr>
     </w:p>
     <w:p>
       <w:pPr>
@@ -1868,6 +1825,7 @@
                 <w:sz w:val="28"/>
                 <w:szCs w:val="28"/>
               </w:rPr>
+              <w:lastRenderedPageBreak/>
               <w:t>Time</w:t>
             </w:r>
           </w:p>
@@ -1995,7 +1953,25 @@
                 <w:sz w:val="28"/>
                 <w:szCs w:val="28"/>
               </w:rPr>
-              <w:t>Dept. of CHTM</w:t>
+              <w:t>College</w:t>
+            </w:r>
+            <w:r>
+              <w:rPr>
+                <w:b/>
+                <w:bCs/>
+                <w:sz w:val="28"/>
+                <w:szCs w:val="28"/>
+              </w:rPr>
+              <w:t xml:space="preserve"> </w:t>
+            </w:r>
+            <w:r>
+              <w:rPr>
+                <w:b/>
+                <w:bCs/>
+                <w:sz w:val="28"/>
+                <w:szCs w:val="28"/>
+              </w:rPr>
+              <w:t>of CHTM</w:t>
             </w:r>
           </w:p>
         </w:tc>
@@ -2040,6 +2016,15 @@
                 <w:szCs w:val="28"/>
               </w:rPr>
             </w:pPr>
+            <w:r>
+              <w:rPr>
+                <w:b/>
+                <w:bCs/>
+                <w:sz w:val="28"/>
+                <w:szCs w:val="28"/>
+              </w:rPr>
+              <w:t xml:space="preserve">Kenneth James </w:t>
+            </w:r>
             <w:proofErr w:type="spellStart"/>
             <w:r>
               <w:rPr>
@@ -2075,7 +2060,16 @@
                 <w:sz w:val="28"/>
                 <w:szCs w:val="28"/>
               </w:rPr>
-              <w:t>Dept. of Nursing</w:t>
+              <w:t>College</w:t>
+            </w:r>
+            <w:r>
+              <w:rPr>
+                <w:b/>
+                <w:bCs/>
+                <w:sz w:val="28"/>
+                <w:szCs w:val="28"/>
+              </w:rPr>
+              <w:t xml:space="preserve"> of Nursing</w:t>
             </w:r>
           </w:p>
         </w:tc>
@@ -2167,7 +2161,25 @@
                 <w:sz w:val="28"/>
                 <w:szCs w:val="28"/>
               </w:rPr>
-              <w:t>Dept. of Business Administration</w:t>
+              <w:t>College</w:t>
+            </w:r>
+            <w:r>
+              <w:rPr>
+                <w:b/>
+                <w:bCs/>
+                <w:sz w:val="28"/>
+                <w:szCs w:val="28"/>
+              </w:rPr>
+              <w:t xml:space="preserve"> </w:t>
+            </w:r>
+            <w:r>
+              <w:rPr>
+                <w:b/>
+                <w:bCs/>
+                <w:sz w:val="28"/>
+                <w:szCs w:val="28"/>
+              </w:rPr>
+              <w:t>of Business Administration</w:t>
             </w:r>
           </w:p>
         </w:tc>
@@ -2212,12 +2224,45 @@
                 <w:szCs w:val="28"/>
               </w:rPr>
             </w:pPr>
-          </w:p>
-        </w:tc>
-        <w:tc>
-          <w:tcPr>
-            <w:tcW w:w="3801" w:type="dxa"/>
-          </w:tcPr>
+            <w:r>
+              <w:rPr>
+                <w:b/>
+                <w:bCs/>
+                <w:sz w:val="28"/>
+                <w:szCs w:val="28"/>
+              </w:rPr>
+              <w:t xml:space="preserve">Mika El </w:t>
+            </w:r>
+            <w:proofErr w:type="spellStart"/>
+            <w:r>
+              <w:rPr>
+                <w:b/>
+                <w:bCs/>
+                <w:sz w:val="28"/>
+                <w:szCs w:val="28"/>
+              </w:rPr>
+              <w:t>Edriz</w:t>
+            </w:r>
+            <w:proofErr w:type="spellEnd"/>
+            <w:r>
+              <w:rPr>
+                <w:b/>
+                <w:bCs/>
+                <w:sz w:val="28"/>
+                <w:szCs w:val="28"/>
+              </w:rPr>
+              <w:t xml:space="preserve"> Del Norte</w:t>
+            </w:r>
+            <w:r>
+              <w:rPr>
+                <w:b/>
+                <w:bCs/>
+                <w:sz w:val="28"/>
+                <w:szCs w:val="28"/>
+              </w:rPr>
+              <w:t xml:space="preserve"> </w:t>
+            </w:r>
+          </w:p>
           <w:p>
             <w:pPr>
               <w:spacing w:after="160" w:line="259" w:lineRule="auto"/>
@@ -2229,6 +2274,61 @@
                 <w:szCs w:val="28"/>
               </w:rPr>
             </w:pPr>
+            <w:r>
+              <w:rPr>
+                <w:b/>
+                <w:bCs/>
+                <w:sz w:val="28"/>
+                <w:szCs w:val="28"/>
+              </w:rPr>
+              <w:t xml:space="preserve">&amp; </w:t>
+            </w:r>
+            <w:r>
+              <w:rPr>
+                <w:b/>
+                <w:bCs/>
+                <w:sz w:val="28"/>
+                <w:szCs w:val="28"/>
+              </w:rPr>
+              <w:t xml:space="preserve">Shan Michael </w:t>
+            </w:r>
+            <w:proofErr w:type="spellStart"/>
+            <w:r>
+              <w:rPr>
+                <w:b/>
+                <w:bCs/>
+                <w:sz w:val="28"/>
+                <w:szCs w:val="28"/>
+              </w:rPr>
+              <w:t>Ycong</w:t>
+            </w:r>
+            <w:proofErr w:type="spellEnd"/>
+          </w:p>
+        </w:tc>
+        <w:tc>
+          <w:tcPr>
+            <w:tcW w:w="3801" w:type="dxa"/>
+          </w:tcPr>
+          <w:p>
+            <w:pPr>
+              <w:spacing w:after="160" w:line="259" w:lineRule="auto"/>
+              <w:cnfStyle w:val="000000000000" w:firstRow="0" w:lastRow="0" w:firstColumn="0" w:lastColumn="0" w:oddVBand="0" w:evenVBand="0" w:oddHBand="0" w:evenHBand="0" w:firstRowFirstColumn="0" w:firstRowLastColumn="0" w:lastRowFirstColumn="0" w:lastRowLastColumn="0"/>
+              <w:rPr>
+                <w:b/>
+                <w:bCs/>
+                <w:sz w:val="28"/>
+                <w:szCs w:val="28"/>
+              </w:rPr>
+            </w:pPr>
+            <w:r>
+              <w:rPr>
+                <w:b/>
+                <w:bCs/>
+                <w:sz w:val="28"/>
+                <w:szCs w:val="28"/>
+              </w:rPr>
+              <w:t>College of Hospitality and Tourism Management</w:t>
+            </w:r>
           </w:p>
         </w:tc>
       </w:tr>
@@ -2615,317 +2715,6 @@
           <w:tcPr>
             <w:cnfStyle w:val="001000000000" w:firstRow="0" w:lastRow="0" w:firstColumn="1" w:lastColumn="0" w:oddVBand="0" w:evenVBand="0" w:oddHBand="0" w:evenHBand="0" w:firstRowFirstColumn="0" w:firstRowLastColumn="0" w:lastRowFirstColumn="0" w:lastRowLastColumn="0"/>
             <w:tcW w:w="2901" w:type="dxa"/>
-          </w:tcPr>
-          <w:p>
-            <w:pPr>
-              <w:spacing w:line="276" w:lineRule="auto"/>
-              <w:jc w:val="center"/>
-              <w:rPr>
-                <w:b w:val="0"/>
-                <w:bCs w:val="0"/>
-                <w:sz w:val="28"/>
-                <w:szCs w:val="28"/>
-              </w:rPr>
-            </w:pPr>
-            <w:r>
-              <w:rPr>
-                <w:sz w:val="28"/>
-                <w:szCs w:val="28"/>
-              </w:rPr>
-              <w:t>–</w:t>
-            </w:r>
-          </w:p>
-        </w:tc>
-        <w:tc>
-          <w:tcPr>
-            <w:tcW w:w="2314" w:type="dxa"/>
-          </w:tcPr>
-          <w:p>
-            <w:pPr>
-              <w:spacing w:line="276" w:lineRule="auto"/>
-              <w:cnfStyle w:val="000000100000" w:firstRow="0" w:lastRow="0" w:firstColumn="0" w:lastColumn="0" w:oddVBand="0" w:evenVBand="0" w:oddHBand="1" w:evenHBand="0" w:firstRowFirstColumn="0" w:firstRowLastColumn="0" w:lastRowFirstColumn="0" w:lastRowLastColumn="0"/>
-              <w:rPr>
-                <w:b/>
-                <w:bCs/>
-                <w:sz w:val="28"/>
-                <w:szCs w:val="28"/>
-              </w:rPr>
-            </w:pPr>
-          </w:p>
-        </w:tc>
-        <w:tc>
-          <w:tcPr>
-            <w:tcW w:w="3801" w:type="dxa"/>
-          </w:tcPr>
-          <w:p>
-            <w:pPr>
-              <w:spacing w:line="276" w:lineRule="auto"/>
-              <w:cnfStyle w:val="000000100000" w:firstRow="0" w:lastRow="0" w:firstColumn="0" w:lastColumn="0" w:oddVBand="0" w:evenVBand="0" w:oddHBand="1" w:evenHBand="0" w:firstRowFirstColumn="0" w:firstRowLastColumn="0" w:lastRowFirstColumn="0" w:lastRowLastColumn="0"/>
-              <w:rPr>
-                <w:b/>
-                <w:bCs/>
-                <w:sz w:val="28"/>
-                <w:szCs w:val="28"/>
-              </w:rPr>
-            </w:pPr>
-          </w:p>
-        </w:tc>
-      </w:tr>
-      <w:tr>
-        <w:tc>
-          <w:tcPr>
-            <w:cnfStyle w:val="001000000000" w:firstRow="0" w:lastRow="0" w:firstColumn="1" w:lastColumn="0" w:oddVBand="0" w:evenVBand="0" w:oddHBand="0" w:evenHBand="0" w:firstRowFirstColumn="0" w:firstRowLastColumn="0" w:lastRowFirstColumn="0" w:lastRowLastColumn="0"/>
-            <w:tcW w:w="2901" w:type="dxa"/>
-          </w:tcPr>
-          <w:p>
-            <w:pPr>
-              <w:spacing w:line="276" w:lineRule="auto"/>
-              <w:jc w:val="center"/>
-              <w:rPr>
-                <w:b w:val="0"/>
-                <w:bCs w:val="0"/>
-                <w:sz w:val="28"/>
-                <w:szCs w:val="28"/>
-              </w:rPr>
-            </w:pPr>
-            <w:r>
-              <w:rPr>
-                <w:sz w:val="28"/>
-                <w:szCs w:val="28"/>
-              </w:rPr>
-              <w:t>–</w:t>
-            </w:r>
-          </w:p>
-        </w:tc>
-        <w:tc>
-          <w:tcPr>
-            <w:tcW w:w="2314" w:type="dxa"/>
-          </w:tcPr>
-          <w:p>
-            <w:pPr>
-              <w:spacing w:line="276" w:lineRule="auto"/>
-              <w:cnfStyle w:val="000000000000" w:firstRow="0" w:lastRow="0" w:firstColumn="0" w:lastColumn="0" w:oddVBand="0" w:evenVBand="0" w:oddHBand="0" w:evenHBand="0" w:firstRowFirstColumn="0" w:firstRowLastColumn="0" w:lastRowFirstColumn="0" w:lastRowLastColumn="0"/>
-              <w:rPr>
-                <w:b/>
-                <w:bCs/>
-                <w:sz w:val="28"/>
-                <w:szCs w:val="28"/>
-              </w:rPr>
-            </w:pPr>
-          </w:p>
-        </w:tc>
-        <w:tc>
-          <w:tcPr>
-            <w:tcW w:w="3801" w:type="dxa"/>
-          </w:tcPr>
-          <w:p>
-            <w:pPr>
-              <w:spacing w:line="276" w:lineRule="auto"/>
-              <w:cnfStyle w:val="000000000000" w:firstRow="0" w:lastRow="0" w:firstColumn="0" w:lastColumn="0" w:oddVBand="0" w:evenVBand="0" w:oddHBand="0" w:evenHBand="0" w:firstRowFirstColumn="0" w:firstRowLastColumn="0" w:lastRowFirstColumn="0" w:lastRowLastColumn="0"/>
-              <w:rPr>
-                <w:b/>
-                <w:bCs/>
-                <w:sz w:val="28"/>
-                <w:szCs w:val="28"/>
-              </w:rPr>
-            </w:pPr>
-          </w:p>
-        </w:tc>
-      </w:tr>
-      <w:tr>
-        <w:trPr>
-          <w:cnfStyle w:val="000000100000" w:firstRow="0" w:lastRow="0" w:firstColumn="0" w:lastColumn="0" w:oddVBand="0" w:evenVBand="0" w:oddHBand="1" w:evenHBand="0" w:firstRowFirstColumn="0" w:firstRowLastColumn="0" w:lastRowFirstColumn="0" w:lastRowLastColumn="0"/>
-        </w:trPr>
-        <w:tc>
-          <w:tcPr>
-            <w:cnfStyle w:val="001000000000" w:firstRow="0" w:lastRow="0" w:firstColumn="1" w:lastColumn="0" w:oddVBand="0" w:evenVBand="0" w:oddHBand="0" w:evenHBand="0" w:firstRowFirstColumn="0" w:firstRowLastColumn="0" w:lastRowFirstColumn="0" w:lastRowLastColumn="0"/>
-            <w:tcW w:w="2901" w:type="dxa"/>
-          </w:tcPr>
-          <w:p>
-            <w:pPr>
-              <w:spacing w:line="276" w:lineRule="auto"/>
-              <w:jc w:val="center"/>
-              <w:rPr>
-                <w:b w:val="0"/>
-                <w:bCs w:val="0"/>
-                <w:sz w:val="28"/>
-                <w:szCs w:val="28"/>
-              </w:rPr>
-            </w:pPr>
-            <w:r>
-              <w:rPr>
-                <w:sz w:val="28"/>
-                <w:szCs w:val="28"/>
-              </w:rPr>
-              <w:t>–</w:t>
-            </w:r>
-          </w:p>
-        </w:tc>
-        <w:tc>
-          <w:tcPr>
-            <w:tcW w:w="2314" w:type="dxa"/>
-          </w:tcPr>
-          <w:p>
-            <w:pPr>
-              <w:spacing w:line="276" w:lineRule="auto"/>
-              <w:cnfStyle w:val="000000100000" w:firstRow="0" w:lastRow="0" w:firstColumn="0" w:lastColumn="0" w:oddVBand="0" w:evenVBand="0" w:oddHBand="1" w:evenHBand="0" w:firstRowFirstColumn="0" w:firstRowLastColumn="0" w:lastRowFirstColumn="0" w:lastRowLastColumn="0"/>
-              <w:rPr>
-                <w:b/>
-                <w:bCs/>
-                <w:sz w:val="28"/>
-                <w:szCs w:val="28"/>
-              </w:rPr>
-            </w:pPr>
-          </w:p>
-        </w:tc>
-        <w:tc>
-          <w:tcPr>
-            <w:tcW w:w="3801" w:type="dxa"/>
-          </w:tcPr>
-          <w:p>
-            <w:pPr>
-              <w:spacing w:line="276" w:lineRule="auto"/>
-              <w:cnfStyle w:val="000000100000" w:firstRow="0" w:lastRow="0" w:firstColumn="0" w:lastColumn="0" w:oddVBand="0" w:evenVBand="0" w:oddHBand="1" w:evenHBand="0" w:firstRowFirstColumn="0" w:firstRowLastColumn="0" w:lastRowFirstColumn="0" w:lastRowLastColumn="0"/>
-              <w:rPr>
-                <w:b/>
-                <w:bCs/>
-                <w:sz w:val="28"/>
-                <w:szCs w:val="28"/>
-              </w:rPr>
-            </w:pPr>
-          </w:p>
-        </w:tc>
-      </w:tr>
-      <w:tr>
-        <w:tc>
-          <w:tcPr>
-            <w:cnfStyle w:val="001000000000" w:firstRow="0" w:lastRow="0" w:firstColumn="1" w:lastColumn="0" w:oddVBand="0" w:evenVBand="0" w:oddHBand="0" w:evenHBand="0" w:firstRowFirstColumn="0" w:firstRowLastColumn="0" w:lastRowFirstColumn="0" w:lastRowLastColumn="0"/>
-            <w:tcW w:w="2901" w:type="dxa"/>
-          </w:tcPr>
-          <w:p>
-            <w:pPr>
-              <w:spacing w:line="276" w:lineRule="auto"/>
-              <w:jc w:val="center"/>
-              <w:rPr>
-                <w:b w:val="0"/>
-                <w:bCs w:val="0"/>
-                <w:sz w:val="28"/>
-                <w:szCs w:val="28"/>
-              </w:rPr>
-            </w:pPr>
-            <w:r>
-              <w:rPr>
-                <w:sz w:val="28"/>
-                <w:szCs w:val="28"/>
-              </w:rPr>
-              <w:t>–</w:t>
-            </w:r>
-          </w:p>
-        </w:tc>
-        <w:tc>
-          <w:tcPr>
-            <w:tcW w:w="2314" w:type="dxa"/>
-          </w:tcPr>
-          <w:p>
-            <w:pPr>
-              <w:spacing w:line="276" w:lineRule="auto"/>
-              <w:cnfStyle w:val="000000000000" w:firstRow="0" w:lastRow="0" w:firstColumn="0" w:lastColumn="0" w:oddVBand="0" w:evenVBand="0" w:oddHBand="0" w:evenHBand="0" w:firstRowFirstColumn="0" w:firstRowLastColumn="0" w:lastRowFirstColumn="0" w:lastRowLastColumn="0"/>
-              <w:rPr>
-                <w:b/>
-                <w:bCs/>
-                <w:sz w:val="28"/>
-                <w:szCs w:val="28"/>
-              </w:rPr>
-            </w:pPr>
-          </w:p>
-        </w:tc>
-        <w:tc>
-          <w:tcPr>
-            <w:tcW w:w="3801" w:type="dxa"/>
-          </w:tcPr>
-          <w:p>
-            <w:pPr>
-              <w:spacing w:line="276" w:lineRule="auto"/>
-              <w:cnfStyle w:val="000000000000" w:firstRow="0" w:lastRow="0" w:firstColumn="0" w:lastColumn="0" w:oddVBand="0" w:evenVBand="0" w:oddHBand="0" w:evenHBand="0" w:firstRowFirstColumn="0" w:firstRowLastColumn="0" w:lastRowFirstColumn="0" w:lastRowLastColumn="0"/>
-              <w:rPr>
-                <w:b/>
-                <w:bCs/>
-                <w:sz w:val="28"/>
-                <w:szCs w:val="28"/>
-              </w:rPr>
-            </w:pPr>
-          </w:p>
-        </w:tc>
-      </w:tr>
-      <w:tr>
-        <w:trPr>
-          <w:cnfStyle w:val="000000100000" w:firstRow="0" w:lastRow="0" w:firstColumn="0" w:lastColumn="0" w:oddVBand="0" w:evenVBand="0" w:oddHBand="1" w:evenHBand="0" w:firstRowFirstColumn="0" w:firstRowLastColumn="0" w:lastRowFirstColumn="0" w:lastRowLastColumn="0"/>
-        </w:trPr>
-        <w:tc>
-          <w:tcPr>
-            <w:cnfStyle w:val="001000000000" w:firstRow="0" w:lastRow="0" w:firstColumn="1" w:lastColumn="0" w:oddVBand="0" w:evenVBand="0" w:oddHBand="0" w:evenHBand="0" w:firstRowFirstColumn="0" w:firstRowLastColumn="0" w:lastRowFirstColumn="0" w:lastRowLastColumn="0"/>
-            <w:tcW w:w="2901" w:type="dxa"/>
-          </w:tcPr>
-          <w:p>
-            <w:pPr>
-              <w:spacing w:line="276" w:lineRule="auto"/>
-              <w:jc w:val="center"/>
-              <w:rPr>
-                <w:b w:val="0"/>
-                <w:bCs w:val="0"/>
-                <w:sz w:val="28"/>
-                <w:szCs w:val="28"/>
-              </w:rPr>
-            </w:pPr>
-            <w:r>
-              <w:rPr>
-                <w:sz w:val="28"/>
-                <w:szCs w:val="28"/>
-              </w:rPr>
-              <w:t>–</w:t>
-            </w:r>
-          </w:p>
-        </w:tc>
-        <w:tc>
-          <w:tcPr>
-            <w:tcW w:w="2314" w:type="dxa"/>
-          </w:tcPr>
-          <w:p>
-            <w:pPr>
-              <w:spacing w:line="276" w:lineRule="auto"/>
-              <w:cnfStyle w:val="000000100000" w:firstRow="0" w:lastRow="0" w:firstColumn="0" w:lastColumn="0" w:oddVBand="0" w:evenVBand="0" w:oddHBand="1" w:evenHBand="0" w:firstRowFirstColumn="0" w:firstRowLastColumn="0" w:lastRowFirstColumn="0" w:lastRowLastColumn="0"/>
-              <w:rPr>
-                <w:b/>
-                <w:bCs/>
-                <w:sz w:val="28"/>
-                <w:szCs w:val="28"/>
-              </w:rPr>
-            </w:pPr>
-          </w:p>
-        </w:tc>
-        <w:tc>
-          <w:tcPr>
-            <w:tcW w:w="3801" w:type="dxa"/>
-          </w:tcPr>
-          <w:p>
-            <w:pPr>
-              <w:spacing w:line="276" w:lineRule="auto"/>
-              <w:cnfStyle w:val="000000100000" w:firstRow="0" w:lastRow="0" w:firstColumn="0" w:lastColumn="0" w:oddVBand="0" w:evenVBand="0" w:oddHBand="1" w:evenHBand="0" w:firstRowFirstColumn="0" w:firstRowLastColumn="0" w:lastRowFirstColumn="0" w:lastRowLastColumn="0"/>
-              <w:rPr>
-                <w:b/>
-                <w:bCs/>
-                <w:sz w:val="28"/>
-                <w:szCs w:val="28"/>
-              </w:rPr>
-            </w:pPr>
-          </w:p>
-        </w:tc>
-      </w:tr>
-      <w:tr>
-        <w:tc>
-          <w:tcPr>
-            <w:cnfStyle w:val="001000000000" w:firstRow="0" w:lastRow="0" w:firstColumn="1" w:lastColumn="0" w:oddVBand="0" w:evenVBand="0" w:oddHBand="0" w:evenHBand="0" w:firstRowFirstColumn="0" w:firstRowLastColumn="0" w:lastRowFirstColumn="0" w:lastRowLastColumn="0"/>
-            <w:tcW w:w="2901" w:type="dxa"/>
             <w:hideMark/>
           </w:tcPr>
           <w:p>
@@ -2953,7 +2742,7 @@
           <w:p>
             <w:pPr>
               <w:spacing w:after="160" w:line="259" w:lineRule="auto"/>
-              <w:cnfStyle w:val="000000000000" w:firstRow="0" w:lastRow="0" w:firstColumn="0" w:lastColumn="0" w:oddVBand="0" w:evenVBand="0" w:oddHBand="0" w:evenHBand="0" w:firstRowFirstColumn="0" w:firstRowLastColumn="0" w:lastRowFirstColumn="0" w:lastRowLastColumn="0"/>
+              <w:cnfStyle w:val="000000100000" w:firstRow="0" w:lastRow="0" w:firstColumn="0" w:lastColumn="0" w:oddVBand="0" w:evenVBand="0" w:oddHBand="1" w:evenHBand="0" w:firstRowFirstColumn="0" w:firstRowLastColumn="0" w:lastRowFirstColumn="0" w:lastRowLastColumn="0"/>
               <w:rPr>
                 <w:b/>
                 <w:bCs/>
@@ -2970,7 +2759,7 @@
           <w:p>
             <w:pPr>
               <w:spacing w:after="160" w:line="259" w:lineRule="auto"/>
-              <w:cnfStyle w:val="000000000000" w:firstRow="0" w:lastRow="0" w:firstColumn="0" w:lastColumn="0" w:oddVBand="0" w:evenVBand="0" w:oddHBand="0" w:evenHBand="0" w:firstRowFirstColumn="0" w:firstRowLastColumn="0" w:lastRowFirstColumn="0" w:lastRowLastColumn="0"/>
+              <w:cnfStyle w:val="000000100000" w:firstRow="0" w:lastRow="0" w:firstColumn="0" w:lastColumn="0" w:oddVBand="0" w:evenVBand="0" w:oddHBand="1" w:evenHBand="0" w:firstRowFirstColumn="0" w:firstRowLastColumn="0" w:lastRowFirstColumn="0" w:lastRowLastColumn="0"/>
               <w:rPr>
                 <w:b/>
                 <w:bCs/>
@@ -3058,7 +2847,6 @@
           <w:sz w:val="28"/>
           <w:szCs w:val="28"/>
         </w:rPr>
-        <w:lastRenderedPageBreak/>
         <w:t>Sincerely,</w:t>
       </w:r>
       <w:r>

</xml_diff>